<commit_message>
- Update reports for Lab3.
</commit_message>
<xml_diff>
--- a/Reports/Lab3.docx
+++ b/Reports/Lab3.docx
@@ -5610,7 +5610,25 @@
           <w:szCs w:val="28"/>
           <w:lang w:val="uk-UA"/>
         </w:rPr>
-        <w:t>Peer Nodes (Alice, Bob, Charlie): Кожен вузол успішно згенерував свою унікальну пару RSA-ключів, виконав процес реєстрації (Registration) на трекері та почав прослуховувати внутрішній порт 5001 для вхідних P2P-з'єднань, а також зовнішні порти (8081, 8082, 8083) для Swagger UI:</w:t>
+        <w:t xml:space="preserve">Peer Nodes (Alice, Bob, </w:t>
+      </w:r>
+      <w:r>
+        <w:rPr>
+          <w:rFonts w:ascii="Times New Roman" w:hAnsi="Times New Roman" w:cs="Times New Roman"/>
+          <w:sz w:val="28"/>
+          <w:szCs w:val="28"/>
+          <w:lang w:val="en-US"/>
+        </w:rPr>
+        <w:t>Nick</w:t>
+      </w:r>
+      <w:r>
+        <w:rPr>
+          <w:rFonts w:ascii="Times New Roman" w:hAnsi="Times New Roman" w:cs="Times New Roman"/>
+          <w:sz w:val="28"/>
+          <w:szCs w:val="28"/>
+          <w:lang w:val="uk-UA"/>
+        </w:rPr>
+        <w:t>): Кожен вузол успішно згенерував свою унікальну пару RSA-ключів, виконав процес реєстрації (Registration) на трекері та почав прослуховувати внутрішній порт 5001 для вхідних P2P-з'єднань, а також зовнішні порти (8081, 8082, 8083) для Swagger UI:</w:t>
       </w:r>
     </w:p>
     <w:p>

</xml_diff>